<commit_message>
Rework photo guidance in new-arrival brief: brand-identifying shots, checklist, NG examples
Co-Authored-By: Claude Opus 5.5 <noreply@anthropic.com>
Claude-Session: https://claude.ai/code/session_01EFkMa7pBd48FUqtUrcDcW8
</commit_message>
<xml_diff>
--- a/reports/新入荷広告_画像制作依頼書_2026-09-29.docx
+++ b/reports/新入荷広告_画像制作依頼書_2026-09-29.docx
@@ -527,7 +527,7 @@
           <w:sz w:val="20"/>
           <w:szCs w:val="20"/>
         </w:rPr>
-        <w:t xml:space="preserve">ただし、見た人が「何が入ったか」を一目でわかるように、ブランドごとに見せる種類・場面を指定しています（品番の指定はしません）。</w:t>
+        <w:t xml:space="preserve">ただし、写真は「そのブランドだから欲しい」と思える理由が写っているものを選んでください（選び方は4章。品番の指定はしません）。</w:t>
       </w:r>
     </w:p>
     <w:p>
@@ -1862,7 +1862,429 @@
           <w:sz w:val="26"/>
           <w:szCs w:val="26"/>
         </w:rPr>
-        <w:t xml:space="preserve">4. 入れないもの（全ブランド共通）</w:t>
+        <w:t xml:space="preserve">4. 写真の選び方（全ブランド共通）</w:t>
+      </w:r>
+    </w:p>
+    <w:p>
+      <w:pPr>
+        <w:spacing w:after="80" w:line="300"/>
+      </w:pPr>
+      <w:r>
+        <w:rPr>
+          <w:rFonts w:ascii="Yu Gothic" w:cs="Yu Gothic" w:eastAsia="Yu Gothic" w:hAnsi="Yu Gothic"/>
+          <w:sz w:val="20"/>
+          <w:szCs w:val="20"/>
+        </w:rPr>
+        <w:t xml:space="preserve">写真は「どのブランドでも成り立つ写真」ではなく、「このブランドだから欲しい」と思える写真を選んでください。次の4つをすべて満たすものを優先します。</w:t>
+      </w:r>
+    </w:p>
+    <w:tbl>
+      <w:tblPr>
+        <w:tblW w:type="dxa" w:w="9640"/>
+        <w:tblBorders>
+          <w:top w:val="single" w:color="auto" w:sz="4"/>
+          <w:left w:val="single" w:color="auto" w:sz="4"/>
+          <w:bottom w:val="single" w:color="auto" w:sz="4"/>
+          <w:right w:val="single" w:color="auto" w:sz="4"/>
+          <w:insideH w:val="single" w:color="auto" w:sz="4"/>
+          <w:insideV w:val="single" w:color="auto" w:sz="4"/>
+        </w:tblBorders>
+      </w:tblPr>
+      <w:tblGrid>
+        <w:gridCol w:w="2600"/>
+        <w:gridCol w:w="7040"/>
+      </w:tblGrid>
+      <w:tr>
+        <w:trPr>
+          <w:tblHeader/>
+        </w:trPr>
+        <w:tc>
+          <w:tcPr>
+            <w:tcW w:type="dxa" w:w="2600"/>
+            <w:tcBorders>
+              <w:top w:val="single" w:color="BFBFBF" w:sz="4"/>
+              <w:left w:val="single" w:color="BFBFBF" w:sz="4"/>
+              <w:bottom w:val="single" w:color="BFBFBF" w:sz="4"/>
+              <w:right w:val="single" w:color="BFBFBF" w:sz="4"/>
+            </w:tcBorders>
+            <w:shd w:fill="1F3864" w:color="auto" w:val="clear"/>
+            <w:tcMar>
+              <w:top w:type="dxa" w:w="60"/>
+              <w:left w:type="dxa" w:w="90"/>
+              <w:bottom w:type="dxa" w:w="60"/>
+              <w:right w:type="dxa" w:w="90"/>
+            </w:tcMar>
+          </w:tcPr>
+          <w:p>
+            <w:pPr>
+              <w:spacing w:after="0" w:line="260"/>
+            </w:pPr>
+            <w:r>
+              <w:rPr>
+                <w:rFonts w:ascii="Yu Gothic" w:cs="Yu Gothic" w:eastAsia="Yu Gothic" w:hAnsi="Yu Gothic"/>
+                <w:b/>
+                <w:bCs/>
+                <w:color w:val="FFFFFF"/>
+                <w:sz w:val="18"/>
+                <w:szCs w:val="18"/>
+              </w:rPr>
+              <w:t xml:space="preserve">確認すること</w:t>
+            </w:r>
+          </w:p>
+        </w:tc>
+        <w:tc>
+          <w:tcPr>
+            <w:tcW w:type="dxa" w:w="7040"/>
+            <w:tcBorders>
+              <w:top w:val="single" w:color="BFBFBF" w:sz="4"/>
+              <w:left w:val="single" w:color="BFBFBF" w:sz="4"/>
+              <w:bottom w:val="single" w:color="BFBFBF" w:sz="4"/>
+              <w:right w:val="single" w:color="BFBFBF" w:sz="4"/>
+            </w:tcBorders>
+            <w:shd w:fill="1F3864" w:color="auto" w:val="clear"/>
+            <w:tcMar>
+              <w:top w:type="dxa" w:w="60"/>
+              <w:left w:type="dxa" w:w="90"/>
+              <w:bottom w:type="dxa" w:w="60"/>
+              <w:right w:type="dxa" w:w="90"/>
+            </w:tcMar>
+          </w:tcPr>
+          <w:p>
+            <w:pPr>
+              <w:spacing w:after="0" w:line="260"/>
+            </w:pPr>
+            <w:r>
+              <w:rPr>
+                <w:rFonts w:ascii="Yu Gothic" w:cs="Yu Gothic" w:eastAsia="Yu Gothic" w:hAnsi="Yu Gothic"/>
+                <w:b/>
+                <w:bCs/>
+                <w:color w:val="FFFFFF"/>
+                <w:sz w:val="18"/>
+                <w:szCs w:val="18"/>
+              </w:rPr>
+              <w:t xml:space="preserve">見るポイント</w:t>
+            </w:r>
+          </w:p>
+        </w:tc>
+      </w:tr>
+      <w:tr>
+        <w:trPr>
+          <w:tblHeader w:val="off"/>
+        </w:trPr>
+        <w:tc>
+          <w:tcPr>
+            <w:tcW w:type="dxa" w:w="2600"/>
+            <w:tcBorders>
+              <w:top w:val="single" w:color="BFBFBF" w:sz="4"/>
+              <w:left w:val="single" w:color="BFBFBF" w:sz="4"/>
+              <w:bottom w:val="single" w:color="BFBFBF" w:sz="4"/>
+              <w:right w:val="single" w:color="BFBFBF" w:sz="4"/>
+            </w:tcBorders>
+            <w:tcMar>
+              <w:top w:type="dxa" w:w="60"/>
+              <w:left w:type="dxa" w:w="90"/>
+              <w:bottom w:type="dxa" w:w="60"/>
+              <w:right w:type="dxa" w:w="90"/>
+            </w:tcMar>
+          </w:tcPr>
+          <w:p>
+            <w:pPr>
+              <w:spacing w:after="0" w:line="260"/>
+            </w:pPr>
+            <w:r>
+              <w:rPr>
+                <w:rFonts w:ascii="Yu Gothic" w:cs="Yu Gothic" w:eastAsia="Yu Gothic" w:hAnsi="Yu Gothic"/>
+                <w:b w:val="false"/>
+                <w:bCs w:val="false"/>
+                <w:color w:val="000000"/>
+                <w:sz w:val="18"/>
+                <w:szCs w:val="18"/>
+              </w:rPr>
+              <w:t xml:space="preserve">このブランドだと分かるか</w:t>
+            </w:r>
+          </w:p>
+        </w:tc>
+        <w:tc>
+          <w:tcPr>
+            <w:tcW w:type="dxa" w:w="7040"/>
+            <w:tcBorders>
+              <w:top w:val="single" w:color="BFBFBF" w:sz="4"/>
+              <w:left w:val="single" w:color="BFBFBF" w:sz="4"/>
+              <w:bottom w:val="single" w:color="BFBFBF" w:sz="4"/>
+              <w:right w:val="single" w:color="BFBFBF" w:sz="4"/>
+            </w:tcBorders>
+            <w:tcMar>
+              <w:top w:type="dxa" w:w="60"/>
+              <w:left w:type="dxa" w:w="90"/>
+              <w:bottom w:type="dxa" w:w="60"/>
+              <w:right w:type="dxa" w:w="90"/>
+            </w:tcMar>
+          </w:tcPr>
+          <w:p>
+            <w:pPr>
+              <w:spacing w:after="0" w:line="260"/>
+            </w:pPr>
+            <w:r>
+              <w:rPr>
+                <w:rFonts w:ascii="Yu Gothic" w:cs="Yu Gothic" w:eastAsia="Yu Gothic" w:hAnsi="Yu Gothic"/>
+                <w:b w:val="false"/>
+                <w:bCs w:val="false"/>
+                <w:color w:val="000000"/>
+                <w:sz w:val="18"/>
+                <w:szCs w:val="18"/>
+              </w:rPr>
+              <w:t xml:space="preserve">ロゴ・特徴的な色やデザイン・素材が写っている。ブランド名を隠しても他社の広告に見えないか</w:t>
+            </w:r>
+          </w:p>
+        </w:tc>
+      </w:tr>
+      <w:tr>
+        <w:trPr>
+          <w:tblHeader w:val="off"/>
+        </w:trPr>
+        <w:tc>
+          <w:tcPr>
+            <w:tcW w:type="dxa" w:w="2600"/>
+            <w:tcBorders>
+              <w:top w:val="single" w:color="BFBFBF" w:sz="4"/>
+              <w:left w:val="single" w:color="BFBFBF" w:sz="4"/>
+              <w:bottom w:val="single" w:color="BFBFBF" w:sz="4"/>
+              <w:right w:val="single" w:color="BFBFBF" w:sz="4"/>
+            </w:tcBorders>
+            <w:shd w:fill="F2F5FA" w:color="auto" w:val="clear"/>
+            <w:tcMar>
+              <w:top w:type="dxa" w:w="60"/>
+              <w:left w:type="dxa" w:w="90"/>
+              <w:bottom w:type="dxa" w:w="60"/>
+              <w:right w:type="dxa" w:w="90"/>
+            </w:tcMar>
+          </w:tcPr>
+          <w:p>
+            <w:pPr>
+              <w:spacing w:after="0" w:line="260"/>
+            </w:pPr>
+            <w:r>
+              <w:rPr>
+                <w:rFonts w:ascii="Yu Gothic" w:cs="Yu Gothic" w:eastAsia="Yu Gothic" w:hAnsi="Yu Gothic"/>
+                <w:b w:val="false"/>
+                <w:bCs w:val="false"/>
+                <w:color w:val="000000"/>
+                <w:sz w:val="18"/>
+                <w:szCs w:val="18"/>
+              </w:rPr>
+              <w:t xml:space="preserve">商品が主役か</w:t>
+            </w:r>
+          </w:p>
+        </w:tc>
+        <w:tc>
+          <w:tcPr>
+            <w:tcW w:type="dxa" w:w="7040"/>
+            <w:tcBorders>
+              <w:top w:val="single" w:color="BFBFBF" w:sz="4"/>
+              <w:left w:val="single" w:color="BFBFBF" w:sz="4"/>
+              <w:bottom w:val="single" w:color="BFBFBF" w:sz="4"/>
+              <w:right w:val="single" w:color="BFBFBF" w:sz="4"/>
+            </w:tcBorders>
+            <w:shd w:fill="F2F5FA" w:color="auto" w:val="clear"/>
+            <w:tcMar>
+              <w:top w:type="dxa" w:w="60"/>
+              <w:left w:type="dxa" w:w="90"/>
+              <w:bottom w:type="dxa" w:w="60"/>
+              <w:right w:type="dxa" w:w="90"/>
+            </w:tcMar>
+          </w:tcPr>
+          <w:p>
+            <w:pPr>
+              <w:spacing w:after="0" w:line="260"/>
+            </w:pPr>
+            <w:r>
+              <w:rPr>
+                <w:rFonts w:ascii="Yu Gothic" w:cs="Yu Gothic" w:eastAsia="Yu Gothic" w:hAnsi="Yu Gothic"/>
+                <w:b w:val="false"/>
+                <w:bCs w:val="false"/>
+                <w:color w:val="000000"/>
+                <w:sz w:val="18"/>
+                <w:szCs w:val="18"/>
+              </w:rPr>
+              <w:t xml:space="preserve">商品が画面の大きな部分を占めている。景色や人物が主役になっていない</w:t>
+            </w:r>
+          </w:p>
+        </w:tc>
+      </w:tr>
+      <w:tr>
+        <w:trPr>
+          <w:tblHeader w:val="off"/>
+        </w:trPr>
+        <w:tc>
+          <w:tcPr>
+            <w:tcW w:type="dxa" w:w="2600"/>
+            <w:tcBorders>
+              <w:top w:val="single" w:color="BFBFBF" w:sz="4"/>
+              <w:left w:val="single" w:color="BFBFBF" w:sz="4"/>
+              <w:bottom w:val="single" w:color="BFBFBF" w:sz="4"/>
+              <w:right w:val="single" w:color="BFBFBF" w:sz="4"/>
+            </w:tcBorders>
+            <w:tcMar>
+              <w:top w:type="dxa" w:w="60"/>
+              <w:left w:type="dxa" w:w="90"/>
+              <w:bottom w:type="dxa" w:w="60"/>
+              <w:right w:type="dxa" w:w="90"/>
+            </w:tcMar>
+          </w:tcPr>
+          <w:p>
+            <w:pPr>
+              <w:spacing w:after="0" w:line="260"/>
+            </w:pPr>
+            <w:r>
+              <w:rPr>
+                <w:rFonts w:ascii="Yu Gothic" w:cs="Yu Gothic" w:eastAsia="Yu Gothic" w:hAnsi="Yu Gothic"/>
+                <w:b w:val="false"/>
+                <w:bCs w:val="false"/>
+                <w:color w:val="000000"/>
+                <w:sz w:val="18"/>
+                <w:szCs w:val="18"/>
+              </w:rPr>
+              <w:t xml:space="preserve">良さが写っているか</w:t>
+            </w:r>
+          </w:p>
+        </w:tc>
+        <w:tc>
+          <w:tcPr>
+            <w:tcW w:type="dxa" w:w="7040"/>
+            <w:tcBorders>
+              <w:top w:val="single" w:color="BFBFBF" w:sz="4"/>
+              <w:left w:val="single" w:color="BFBFBF" w:sz="4"/>
+              <w:bottom w:val="single" w:color="BFBFBF" w:sz="4"/>
+              <w:right w:val="single" w:color="BFBFBF" w:sz="4"/>
+            </w:tcBorders>
+            <w:tcMar>
+              <w:top w:type="dxa" w:w="60"/>
+              <w:left w:type="dxa" w:w="90"/>
+              <w:bottom w:type="dxa" w:w="60"/>
+              <w:right w:type="dxa" w:w="90"/>
+            </w:tcMar>
+          </w:tcPr>
+          <w:p>
+            <w:pPr>
+              <w:spacing w:after="0" w:line="260"/>
+            </w:pPr>
+            <w:r>
+              <w:rPr>
+                <w:rFonts w:ascii="Yu Gothic" w:cs="Yu Gothic" w:eastAsia="Yu Gothic" w:hAnsi="Yu Gothic"/>
+                <w:b w:val="false"/>
+                <w:bCs w:val="false"/>
+                <w:color w:val="000000"/>
+                <w:sz w:val="18"/>
+                <w:szCs w:val="18"/>
+              </w:rPr>
+              <w:t xml:space="preserve">素材の質感、機能が働いている瞬間（雪をはじく、握る、寒さの中で暖かい）が見える</w:t>
+            </w:r>
+          </w:p>
+        </w:tc>
+      </w:tr>
+      <w:tr>
+        <w:trPr>
+          <w:tblHeader w:val="off"/>
+        </w:trPr>
+        <w:tc>
+          <w:tcPr>
+            <w:tcW w:type="dxa" w:w="2600"/>
+            <w:tcBorders>
+              <w:top w:val="single" w:color="BFBFBF" w:sz="4"/>
+              <w:left w:val="single" w:color="BFBFBF" w:sz="4"/>
+              <w:bottom w:val="single" w:color="BFBFBF" w:sz="4"/>
+              <w:right w:val="single" w:color="BFBFBF" w:sz="4"/>
+            </w:tcBorders>
+            <w:shd w:fill="F2F5FA" w:color="auto" w:val="clear"/>
+            <w:tcMar>
+              <w:top w:type="dxa" w:w="60"/>
+              <w:left w:type="dxa" w:w="90"/>
+              <w:bottom w:type="dxa" w:w="60"/>
+              <w:right w:type="dxa" w:w="90"/>
+            </w:tcMar>
+          </w:tcPr>
+          <w:p>
+            <w:pPr>
+              <w:spacing w:after="0" w:line="260"/>
+            </w:pPr>
+            <w:r>
+              <w:rPr>
+                <w:rFonts w:ascii="Yu Gothic" w:cs="Yu Gothic" w:eastAsia="Yu Gothic" w:hAnsi="Yu Gothic"/>
+                <w:b w:val="false"/>
+                <w:bCs w:val="false"/>
+                <w:color w:val="000000"/>
+                <w:sz w:val="18"/>
+                <w:szCs w:val="18"/>
+              </w:rPr>
+              <w:t xml:space="preserve">リンク先で買えるか</w:t>
+            </w:r>
+          </w:p>
+        </w:tc>
+        <w:tc>
+          <w:tcPr>
+            <w:tcW w:type="dxa" w:w="7040"/>
+            <w:tcBorders>
+              <w:top w:val="single" w:color="BFBFBF" w:sz="4"/>
+              <w:left w:val="single" w:color="BFBFBF" w:sz="4"/>
+              <w:bottom w:val="single" w:color="BFBFBF" w:sz="4"/>
+              <w:right w:val="single" w:color="BFBFBF" w:sz="4"/>
+            </w:tcBorders>
+            <w:shd w:fill="F2F5FA" w:color="auto" w:val="clear"/>
+            <w:tcMar>
+              <w:top w:type="dxa" w:w="60"/>
+              <w:left w:type="dxa" w:w="90"/>
+              <w:bottom w:type="dxa" w:w="60"/>
+              <w:right w:type="dxa" w:w="90"/>
+            </w:tcMar>
+          </w:tcPr>
+          <w:p>
+            <w:pPr>
+              <w:spacing w:after="0" w:line="260"/>
+            </w:pPr>
+            <w:r>
+              <w:rPr>
+                <w:rFonts w:ascii="Yu Gothic" w:cs="Yu Gothic" w:eastAsia="Yu Gothic" w:hAnsi="Yu Gothic"/>
+                <w:b w:val="false"/>
+                <w:bCs w:val="false"/>
+                <w:color w:val="000000"/>
+                <w:sz w:val="18"/>
+                <w:szCs w:val="18"/>
+              </w:rPr>
+              <w:t xml:space="preserve">写っている商品・色が今季の入荷分で、リンク先のページに並んでいる</w:t>
+            </w:r>
+          </w:p>
+        </w:tc>
+      </w:tr>
+    </w:tbl>
+    <w:p>
+      <w:pPr>
+        <w:spacing w:after="80" w:line="300"/>
+      </w:pPr>
+      <w:r>
+        <w:rPr>
+          <w:rFonts w:ascii="Yu Gothic" w:cs="Yu Gothic" w:eastAsia="Yu Gothic" w:hAnsi="Yu Gothic"/>
+          <w:color w:val="555555"/>
+          <w:sz w:val="17"/>
+          <w:szCs w:val="17"/>
+        </w:rPr>
+        <w:t xml:space="preserve">スマホの小さな画面で1秒見て伝わるかを最後に確認してください。</w:t>
+      </w:r>
+    </w:p>
+    <w:p>
+      <w:pPr>
+        <w:pStyle w:val="Heading1"/>
+        <w:spacing w:after="120" w:before="280"/>
+      </w:pPr>
+      <w:r>
+        <w:rPr>
+          <w:rFonts w:ascii="Yu Gothic" w:cs="Yu Gothic" w:eastAsia="Yu Gothic" w:hAnsi="Yu Gothic"/>
+          <w:b/>
+          <w:bCs/>
+          <w:color w:val="1F3864"/>
+          <w:sz w:val="26"/>
+          <w:szCs w:val="26"/>
+        </w:rPr>
+        <w:t xml:space="preserve">5. 入れないもの（全ブランド共通）</w:t>
       </w:r>
     </w:p>
     <w:p>
@@ -1952,7 +2374,7 @@
           <w:sz w:val="26"/>
           <w:szCs w:val="26"/>
         </w:rPr>
-        <w:t xml:space="preserve">5. ACLIMA</w:t>
+        <w:t xml:space="preserve">6. ACLIMA</w:t>
       </w:r>
     </w:p>
     <w:tbl>
@@ -2219,7 +2641,7 @@
                 <w:sz w:val="18"/>
                 <w:szCs w:val="18"/>
               </w:rPr>
-              <w:t xml:space="preserve">写真の場面</w:t>
+              <w:t xml:space="preserve">写真で見せること</w:t>
             </w:r>
           </w:p>
         </w:tc>
@@ -2252,7 +2674,7 @@
                 <w:sz w:val="18"/>
                 <w:szCs w:val="18"/>
               </w:rPr>
-              <w:t xml:space="preserve">寒い屋外（雪の森・冬の山小屋・朝の冷えた空気）で、ウールのベースレイヤーを着ている人物。肌に近いウールの質感（編み目・起毛感）が伝わる寄りのカットもあると良い</w:t>
+              <w:t xml:space="preserve">ウールそのものが主役。WARMWOOL の起毛やループ、WOOLNET の網目が、スマホの画面でも分かるくらい寄った写真。着用カットなら、寒い場所で一枚で着ていて暖かそうに見えるもの（吐く息が白い、霜・雪など寒さが分かる要素）</w:t>
             </w:r>
           </w:p>
         </w:tc>
@@ -2765,6 +3187,59 @@
           <w:szCs w:val="17"/>
         </w:rPr>
         <w:t xml:space="preserve">コピーは仮。写真に合わせて文字量を減らすのは可（見出しだけ、など）。</w:t>
+      </w:r>
+    </w:p>
+    <w:p>
+      <w:pPr>
+        <w:pStyle w:val="Heading2"/>
+        <w:spacing w:after="80" w:before="200"/>
+      </w:pPr>
+      <w:r>
+        <w:rPr>
+          <w:rFonts w:ascii="Yu Gothic" w:cs="Yu Gothic" w:eastAsia="Yu Gothic" w:hAnsi="Yu Gothic"/>
+          <w:b/>
+          <w:bCs/>
+          <w:color w:val="1F3864"/>
+          <w:sz w:val="22"/>
+          <w:szCs w:val="22"/>
+        </w:rPr>
+        <w:t xml:space="preserve">選ばない写真（NG）</w:t>
+      </w:r>
+    </w:p>
+    <w:p>
+      <w:pPr>
+        <w:pStyle w:val="ListParagraph"/>
+        <w:numPr>
+          <w:ilvl w:val="0"/>
+          <w:numId w:val="2"/>
+        </w:numPr>
+        <w:spacing w:after="60" w:line="300"/>
+      </w:pPr>
+      <w:r>
+        <w:rPr>
+          <w:rFonts w:ascii="Yu Gothic" w:cs="Yu Gothic" w:eastAsia="Yu Gothic" w:hAnsi="Yu Gothic"/>
+          <w:sz w:val="20"/>
+          <w:szCs w:val="20"/>
+        </w:rPr>
+        <w:t xml:space="preserve">素材の違いが見えない引きの写真（ただのインナー姿に見える）</w:t>
+      </w:r>
+    </w:p>
+    <w:p>
+      <w:pPr>
+        <w:pStyle w:val="ListParagraph"/>
+        <w:numPr>
+          <w:ilvl w:val="0"/>
+          <w:numId w:val="2"/>
+        </w:numPr>
+        <w:spacing w:after="60" w:line="300"/>
+      </w:pPr>
+      <w:r>
+        <w:rPr>
+          <w:rFonts w:ascii="Yu Gothic" w:cs="Yu Gothic" w:eastAsia="Yu Gothic" w:hAnsi="Yu Gothic"/>
+          <w:sz w:val="20"/>
+          <w:szCs w:val="20"/>
+        </w:rPr>
+        <w:t xml:space="preserve">他社の下着と区別がつかない無地の着用写真</w:t>
       </w:r>
     </w:p>
     <w:p>
@@ -2835,7 +3310,7 @@
           <w:sz w:val="26"/>
           <w:szCs w:val="26"/>
         </w:rPr>
-        <w:t xml:space="preserve">6. NORRØNA</w:t>
+        <w:t xml:space="preserve">7. NORRØNA</w:t>
       </w:r>
     </w:p>
     <w:tbl>
@@ -3102,7 +3577,7 @@
                 <w:sz w:val="18"/>
                 <w:szCs w:val="18"/>
               </w:rPr>
-              <w:t xml:space="preserve">写真の場面</w:t>
+              <w:t xml:space="preserve">写真で見せること</w:t>
             </w:r>
           </w:p>
         </w:tc>
@@ -3135,7 +3610,7 @@
                 <w:sz w:val="18"/>
                 <w:szCs w:val="18"/>
               </w:rPr>
-              <w:t xml:space="preserve">雪山を滑っている、または滑る直前の人物。深い雪・急斜面・北欧の山の空気感。ウェアの色が雪に映えるカット</w:t>
+              <w:t xml:space="preserve">ウェアが主役として大きく写り、ひと目で NORRØNA と分かる写真。lofoten 特有のはっきりした配色・切り替えのデザイン、胸や袖のロゴが見えること。深雪や吹雪の中で、ウェアが働いている瞬間（雪煙を浴びている、雪をはじいている）だと、なお良い。写っている色・モデルは今季入荷分で、リンク先で買えるもの</w:t>
             </w:r>
           </w:p>
         </w:tc>
@@ -3648,6 +4123,77 @@
           <w:szCs w:val="17"/>
         </w:rPr>
         <w:t xml:space="preserve">コピーは仮。写真に合わせて文字量を減らすのは可（見出しだけ、など）。</w:t>
+      </w:r>
+    </w:p>
+    <w:p>
+      <w:pPr>
+        <w:pStyle w:val="Heading2"/>
+        <w:spacing w:after="80" w:before="200"/>
+      </w:pPr>
+      <w:r>
+        <w:rPr>
+          <w:rFonts w:ascii="Yu Gothic" w:cs="Yu Gothic" w:eastAsia="Yu Gothic" w:hAnsi="Yu Gothic"/>
+          <w:b/>
+          <w:bCs/>
+          <w:color w:val="1F3864"/>
+          <w:sz w:val="22"/>
+          <w:szCs w:val="22"/>
+        </w:rPr>
+        <w:t xml:space="preserve">選ばない写真（NG）</w:t>
+      </w:r>
+    </w:p>
+    <w:p>
+      <w:pPr>
+        <w:pStyle w:val="ListParagraph"/>
+        <w:numPr>
+          <w:ilvl w:val="0"/>
+          <w:numId w:val="2"/>
+        </w:numPr>
+        <w:spacing w:after="60" w:line="300"/>
+      </w:pPr>
+      <w:r>
+        <w:rPr>
+          <w:rFonts w:ascii="Yu Gothic" w:cs="Yu Gothic" w:eastAsia="Yu Gothic" w:hAnsi="Yu Gothic"/>
+          <w:sz w:val="20"/>
+          <w:szCs w:val="20"/>
+        </w:rPr>
+        <w:t xml:space="preserve">人物が小さく、雪山の景色が主役の写真（どのスキーブランドでも同じに見える）</w:t>
+      </w:r>
+    </w:p>
+    <w:p>
+      <w:pPr>
+        <w:pStyle w:val="ListParagraph"/>
+        <w:numPr>
+          <w:ilvl w:val="0"/>
+          <w:numId w:val="2"/>
+        </w:numPr>
+        <w:spacing w:after="60" w:line="300"/>
+      </w:pPr>
+      <w:r>
+        <w:rPr>
+          <w:rFonts w:ascii="Yu Gothic" w:cs="Yu Gothic" w:eastAsia="Yu Gothic" w:hAnsi="Yu Gothic"/>
+          <w:sz w:val="20"/>
+          <w:szCs w:val="20"/>
+        </w:rPr>
+        <w:t xml:space="preserve">ロゴや特徴的な配色が見えない写真</w:t>
+      </w:r>
+    </w:p>
+    <w:p>
+      <w:pPr>
+        <w:pStyle w:val="ListParagraph"/>
+        <w:numPr>
+          <w:ilvl w:val="0"/>
+          <w:numId w:val="2"/>
+        </w:numPr>
+        <w:spacing w:after="60" w:line="300"/>
+      </w:pPr>
+      <w:r>
+        <w:rPr>
+          <w:rFonts w:ascii="Yu Gothic" w:cs="Yu Gothic" w:eastAsia="Yu Gothic" w:hAnsi="Yu Gothic"/>
+          <w:sz w:val="20"/>
+          <w:szCs w:val="20"/>
+        </w:rPr>
+        <w:t xml:space="preserve">入荷していない色・旧モデルが主役の写真</w:t>
       </w:r>
     </w:p>
     <w:p>
@@ -3718,7 +4264,7 @@
           <w:sz w:val="26"/>
           <w:szCs w:val="26"/>
         </w:rPr>
-        <w:t xml:space="preserve">7. HOUDINI</w:t>
+        <w:t xml:space="preserve">8. HOUDINI</w:t>
       </w:r>
     </w:p>
     <w:tbl>
@@ -3985,7 +4531,7 @@
                 <w:sz w:val="18"/>
                 <w:szCs w:val="18"/>
               </w:rPr>
-              <w:t xml:space="preserve">写真の場面</w:t>
+              <w:t xml:space="preserve">写真で見せること</w:t>
             </w:r>
           </w:p>
         </w:tc>
@@ -4018,7 +4564,7 @@
                 <w:sz w:val="18"/>
                 <w:szCs w:val="18"/>
               </w:rPr>
-              <w:t xml:space="preserve">山や街で、中間着を一枚で着ている人物。アクティブな場面と日常の場面のどちらでも。シェル（アウター）が主役に見えないカット</w:t>
+              <w:t xml:space="preserve">中間着の素材とシルエットが主役。Power シリーズのフリースの表情、Lykan・Alto のウールの質感など、HOUDINI らしい素材が分かる寄りの写真、または一枚で着て様になっている全身の写真（ミニマルなデザインと色が伝わるもの）。写っている色は今季入荷分</w:t>
             </w:r>
           </w:p>
         </w:tc>
@@ -4531,6 +5077,77 @@
           <w:szCs w:val="17"/>
         </w:rPr>
         <w:t xml:space="preserve">コピーは仮。写真に合わせて文字量を減らすのは可（見出しだけ、など）。</w:t>
+      </w:r>
+    </w:p>
+    <w:p>
+      <w:pPr>
+        <w:pStyle w:val="Heading2"/>
+        <w:spacing w:after="80" w:before="200"/>
+      </w:pPr>
+      <w:r>
+        <w:rPr>
+          <w:rFonts w:ascii="Yu Gothic" w:cs="Yu Gothic" w:eastAsia="Yu Gothic" w:hAnsi="Yu Gothic"/>
+          <w:b/>
+          <w:bCs/>
+          <w:color w:val="1F3864"/>
+          <w:sz w:val="22"/>
+          <w:szCs w:val="22"/>
+        </w:rPr>
+        <w:t xml:space="preserve">選ばない写真（NG）</w:t>
+      </w:r>
+    </w:p>
+    <w:p>
+      <w:pPr>
+        <w:pStyle w:val="ListParagraph"/>
+        <w:numPr>
+          <w:ilvl w:val="0"/>
+          <w:numId w:val="2"/>
+        </w:numPr>
+        <w:spacing w:after="60" w:line="300"/>
+      </w:pPr>
+      <w:r>
+        <w:rPr>
+          <w:rFonts w:ascii="Yu Gothic" w:cs="Yu Gothic" w:eastAsia="Yu Gothic" w:hAnsi="Yu Gothic"/>
+          <w:sz w:val="20"/>
+          <w:szCs w:val="20"/>
+        </w:rPr>
+        <w:t xml:space="preserve">アウター（シェル）が主役の写真</w:t>
+      </w:r>
+    </w:p>
+    <w:p>
+      <w:pPr>
+        <w:pStyle w:val="ListParagraph"/>
+        <w:numPr>
+          <w:ilvl w:val="0"/>
+          <w:numId w:val="2"/>
+        </w:numPr>
+        <w:spacing w:after="60" w:line="300"/>
+      </w:pPr>
+      <w:r>
+        <w:rPr>
+          <w:rFonts w:ascii="Yu Gothic" w:cs="Yu Gothic" w:eastAsia="Yu Gothic" w:hAnsi="Yu Gothic"/>
+          <w:sz w:val="20"/>
+          <w:szCs w:val="20"/>
+        </w:rPr>
+        <w:t xml:space="preserve">素材感の分からない引きの写真</w:t>
+      </w:r>
+    </w:p>
+    <w:p>
+      <w:pPr>
+        <w:pStyle w:val="ListParagraph"/>
+        <w:numPr>
+          <w:ilvl w:val="0"/>
+          <w:numId w:val="2"/>
+        </w:numPr>
+        <w:spacing w:after="60" w:line="300"/>
+      </w:pPr>
+      <w:r>
+        <w:rPr>
+          <w:rFonts w:ascii="Yu Gothic" w:cs="Yu Gothic" w:eastAsia="Yu Gothic" w:hAnsi="Yu Gothic"/>
+          <w:sz w:val="20"/>
+          <w:szCs w:val="20"/>
+        </w:rPr>
+        <w:t xml:space="preserve">他ブランドのウェアと重ね着していて HOUDINI がどれか分からない写真</w:t>
       </w:r>
     </w:p>
     <w:p>
@@ -4601,7 +5218,7 @@
           <w:sz w:val="26"/>
           <w:szCs w:val="26"/>
         </w:rPr>
-        <w:t xml:space="preserve">8. HESTRA</w:t>
+        <w:t xml:space="preserve">9. HESTRA</w:t>
       </w:r>
     </w:p>
     <w:tbl>
@@ -4868,7 +5485,7 @@
                 <w:sz w:val="18"/>
                 <w:szCs w:val="18"/>
               </w:rPr>
-              <w:t xml:space="preserve">写真の場面</w:t>
+              <w:t xml:space="preserve">写真で見せること</w:t>
             </w:r>
           </w:p>
         </w:tc>
@@ -4901,7 +5518,7 @@
                 <w:sz w:val="18"/>
                 <w:szCs w:val="18"/>
               </w:rPr>
-              <w:t xml:space="preserve">雪の中でグローブを着けた手元が主役のカット。革の質感が見える寄り、または雪山でストックやボードを握る手元</w:t>
+              <w:t xml:space="preserve">グローブだけが主役の手元アップ。革のしわ・ステッチ・HESTRA のタグなど、作りの良さとブランドが分かる寄りの写真。使う場面なら、雪の中でストックやロープを握る・雪をつかむなど、手元が働いている瞬間</w:t>
             </w:r>
           </w:p>
         </w:tc>
@@ -5414,6 +6031,59 @@
           <w:szCs w:val="17"/>
         </w:rPr>
         <w:t xml:space="preserve">コピーは仮。写真に合わせて文字量を減らすのは可（見出しだけ、など）。</w:t>
+      </w:r>
+    </w:p>
+    <w:p>
+      <w:pPr>
+        <w:pStyle w:val="Heading2"/>
+        <w:spacing w:after="80" w:before="200"/>
+      </w:pPr>
+      <w:r>
+        <w:rPr>
+          <w:rFonts w:ascii="Yu Gothic" w:cs="Yu Gothic" w:eastAsia="Yu Gothic" w:hAnsi="Yu Gothic"/>
+          <w:b/>
+          <w:bCs/>
+          <w:color w:val="1F3864"/>
+          <w:sz w:val="22"/>
+          <w:szCs w:val="22"/>
+        </w:rPr>
+        <w:t xml:space="preserve">選ばない写真（NG）</w:t>
+      </w:r>
+    </w:p>
+    <w:p>
+      <w:pPr>
+        <w:pStyle w:val="ListParagraph"/>
+        <w:numPr>
+          <w:ilvl w:val="0"/>
+          <w:numId w:val="2"/>
+        </w:numPr>
+        <w:spacing w:after="60" w:line="300"/>
+      </w:pPr>
+      <w:r>
+        <w:rPr>
+          <w:rFonts w:ascii="Yu Gothic" w:cs="Yu Gothic" w:eastAsia="Yu Gothic" w:hAnsi="Yu Gothic"/>
+          <w:sz w:val="20"/>
+          <w:szCs w:val="20"/>
+        </w:rPr>
+        <w:t xml:space="preserve">手元が小さく、全身や景色が主役の写真</w:t>
+      </w:r>
+    </w:p>
+    <w:p>
+      <w:pPr>
+        <w:pStyle w:val="ListParagraph"/>
+        <w:numPr>
+          <w:ilvl w:val="0"/>
+          <w:numId w:val="2"/>
+        </w:numPr>
+        <w:spacing w:after="60" w:line="300"/>
+      </w:pPr>
+      <w:r>
+        <w:rPr>
+          <w:rFonts w:ascii="Yu Gothic" w:cs="Yu Gothic" w:eastAsia="Yu Gothic" w:hAnsi="Yu Gothic"/>
+          <w:sz w:val="20"/>
+          <w:szCs w:val="20"/>
+        </w:rPr>
+        <w:t xml:space="preserve">ブランドのタグやロゴが見えない写真</w:t>
       </w:r>
     </w:p>
     <w:p>
@@ -5484,7 +6154,7 @@
           <w:sz w:val="26"/>
           <w:szCs w:val="26"/>
         </w:rPr>
-        <w:t xml:space="preserve">9. POC</w:t>
+        <w:t xml:space="preserve">10. POC</w:t>
       </w:r>
     </w:p>
     <w:tbl>
@@ -5751,7 +6421,7 @@
                 <w:sz w:val="18"/>
                 <w:szCs w:val="18"/>
               </w:rPr>
-              <w:t xml:space="preserve">写真の場面</w:t>
+              <w:t xml:space="preserve">写真で見せること</w:t>
             </w:r>
           </w:p>
         </w:tc>
@@ -5784,7 +6454,7 @@
                 <w:sz w:val="18"/>
                 <w:szCs w:val="18"/>
               </w:rPr>
-              <w:t xml:space="preserve">新作のヘルメットとゴーグルを着けたスキーヤー・スノーボーダー。顔まわりの寄りのカットで、ヘルメットとゴーグルの形・色がはっきり見えるもの</w:t>
+              <w:t xml:space="preserve">顔まわりの寄り。ヘルメットとゴーグルの形・色・ロゴが画面の大きな部分を占める写真。POC らしい形（丸みのあるシェル、大きなレンズ）が一瞬で分かること。写っているのは今季の新作で、リンク先で買えるモデル</w:t>
             </w:r>
           </w:p>
         </w:tc>
@@ -6297,6 +6967,59 @@
           <w:szCs w:val="17"/>
         </w:rPr>
         <w:t xml:space="preserve">コピーは仮。写真に合わせて文字量を減らすのは可（見出しだけ、など）。</w:t>
+      </w:r>
+    </w:p>
+    <w:p>
+      <w:pPr>
+        <w:pStyle w:val="Heading2"/>
+        <w:spacing w:after="80" w:before="200"/>
+      </w:pPr>
+      <w:r>
+        <w:rPr>
+          <w:rFonts w:ascii="Yu Gothic" w:cs="Yu Gothic" w:eastAsia="Yu Gothic" w:hAnsi="Yu Gothic"/>
+          <w:b/>
+          <w:bCs/>
+          <w:color w:val="1F3864"/>
+          <w:sz w:val="22"/>
+          <w:szCs w:val="22"/>
+        </w:rPr>
+        <w:t xml:space="preserve">選ばない写真（NG）</w:t>
+      </w:r>
+    </w:p>
+    <w:p>
+      <w:pPr>
+        <w:pStyle w:val="ListParagraph"/>
+        <w:numPr>
+          <w:ilvl w:val="0"/>
+          <w:numId w:val="2"/>
+        </w:numPr>
+        <w:spacing w:after="60" w:line="300"/>
+      </w:pPr>
+      <w:r>
+        <w:rPr>
+          <w:rFonts w:ascii="Yu Gothic" w:cs="Yu Gothic" w:eastAsia="Yu Gothic" w:hAnsi="Yu Gothic"/>
+          <w:sz w:val="20"/>
+          <w:szCs w:val="20"/>
+        </w:rPr>
+        <w:t xml:space="preserve">人物が小さく、ヘルメットの形が分からない写真</w:t>
+      </w:r>
+    </w:p>
+    <w:p>
+      <w:pPr>
+        <w:pStyle w:val="ListParagraph"/>
+        <w:numPr>
+          <w:ilvl w:val="0"/>
+          <w:numId w:val="2"/>
+        </w:numPr>
+        <w:spacing w:after="60" w:line="300"/>
+      </w:pPr>
+      <w:r>
+        <w:rPr>
+          <w:rFonts w:ascii="Yu Gothic" w:cs="Yu Gothic" w:eastAsia="Yu Gothic" w:hAnsi="Yu Gothic"/>
+          <w:sz w:val="20"/>
+          <w:szCs w:val="20"/>
+        </w:rPr>
+        <w:t xml:space="preserve">旧モデルや入荷していない色が主役の写真</w:t>
       </w:r>
     </w:p>
     <w:p>

</xml_diff>